<commit_message>
Adaptar la RSL a autor único con cribado asistido y guía desde cero
- Manuscrito: autor único; selección por un revisor con asistente basado
  en reglas, exclusiones a texto completo con cita y re-cribado ciego
  (kappa intra-revisor); extracción y calidad asistidas y verificadas por
  el autor; amenaza a la validez y declaración de uso de IA actualizadas.
- Scripts: 03 pre-clasifica título/resumen (Excluir por regla / Probable
  incluir / Revisar); 04 cierra cada etapa y mide el acuerdo autor-
  asistente; 04b re-cribado ciego; 05b lee los PDF y propone la decisión
  con citas y páginas; 07 verificación de la calidad propuesta; 06 escribe
  las nuevas medidas de fiabilidad.
- Documentación: guía completa desde cero, textos de Parsif.al para
  copiar y pegar, manual de criterios para un solo revisor, pendientes y
  respuesta al ingeniero actualizados.

Co-Authored-By: Claude Opus 5.5 <noreply@anthropic.com>
Claude-Session: https://claude.ai/code/session_01BxN9W1XmdV2QxsHjBBQujW
</commit_message>
<xml_diff>
--- a/RSL/respuesta_revision.docx
+++ b/RSL/respuesta_revision.docx
@@ -1173,19 +1173,19 @@
               <w:jc w:val="left"/>
             </w:pPr>
             <w:r>
-              <w:t xml:space="preserve">Acepto</w:t>
-            </w:r>
-          </w:p>
-        </w:tc>
-        <w:tc>
-          <w:tcPr/>
-          <w:p>
-            <w:pPr>
-              <w:pStyle w:val="Compact"/>
-              <w:jc w:val="left"/>
-            </w:pPr>
-            <w:r>
-              <w:t xml:space="preserve">Se describe el cribado por dos revisores independientes con un tercero para desempates y se reporta el kappa de Cohen. El PRISMA incluye los motivos de exclusión por criterio.</w:t>
+              <w:t xml:space="preserve">Acepto en parte</w:t>
+            </w:r>
+          </w:p>
+        </w:tc>
+        <w:tc>
+          <w:tcPr/>
+          <w:p>
+            <w:pPr>
+              <w:pStyle w:val="Compact"/>
+              <w:jc w:val="left"/>
+            </w:pPr>
+            <w:r>
+              <w:t xml:space="preserve">La revisión es de</w:t>
             </w:r>
             <w:r>
               <w:t xml:space="preserve"> </w:t>
@@ -1195,25 +1195,38 @@
                 <w:bCs/>
                 <w:b/>
               </w:rPr>
-              <w:t xml:space="preserve">Las cifras dependen del re-cribado</w:t>
+              <w:t xml:space="preserve">autor único</w:t>
+            </w:r>
+            <w:r>
+              <w:t xml:space="preserve">, así que no hay un segundo revisor. Se declara explícitamente y se mitiga de tres formas: (1) un asistente de cribado por reglas transparentes, que solo propone exclusiones objetivas verificadas por el autor, y cuyo acuerdo con el autor se reporta; (2) cada exclusión a texto completo lleva la cita del artículo; (3) un re-cribado ciego de una muestra aleatoria, al menos 7 días después, con su kappa intra-revisor. El PRISMA incluye los motivos de exclusión por criterio. Se añade como amenaza a la validez.</w:t>
             </w:r>
             <w:r>
               <w:t xml:space="preserve"> </w:t>
             </w:r>
             <w:r>
-              <w:t xml:space="preserve">(pendiente de los autores).</w:t>
-            </w:r>
-          </w:p>
-        </w:tc>
-        <w:tc>
-          <w:tcPr/>
-          <w:p>
-            <w:pPr>
-              <w:pStyle w:val="Compact"/>
-              <w:jc w:val="left"/>
-            </w:pPr>
-            <w:r>
-              <w:t xml:space="preserve">§3.5; Fig. 1</w:t>
+              <w:rPr>
+                <w:bCs/>
+                <w:b/>
+              </w:rPr>
+              <w:t xml:space="preserve">Las cifras dependen del cribado</w:t>
+            </w:r>
+            <w:r>
+              <w:t xml:space="preserve"> </w:t>
+            </w:r>
+            <w:r>
+              <w:t xml:space="preserve">(pendiente del autor).</w:t>
+            </w:r>
+          </w:p>
+        </w:tc>
+        <w:tc>
+          <w:tcPr/>
+          <w:p>
+            <w:pPr>
+              <w:pStyle w:val="Compact"/>
+              <w:jc w:val="left"/>
+            </w:pPr>
+            <w:r>
+              <w:t xml:space="preserve">§3.5; §5.4; Fig. 1</w:t>
             </w:r>
           </w:p>
         </w:tc>
@@ -1228,7 +1241,13 @@
               <w:rPr>
                 <w:rStyle w:val="VerbatimChar"/>
               </w:rPr>
-              <w:t xml:space="preserve">datos_busqueda.tex</w:t>
+              <w:t xml:space="preserve">cribado/</w:t>
+            </w:r>
+            <w:r>
+              <w:t xml:space="preserve"> </w:t>
+            </w:r>
+            <w:r>
+              <w:t xml:space="preserve">(scripts, manual, hojas de decisión)</w:t>
             </w:r>
           </w:p>
         </w:tc>
@@ -1836,7 +1855,23 @@
               <w:jc w:val="left"/>
             </w:pPr>
             <w:r>
-              <w:t xml:space="preserve">Se eliminó la afiliación 2 inexistente y se unificó el nombre del tercer autor como «Ender Prieto Quispe».</w:t>
+              <w:t xml:space="preserve">El manuscrito pasa a tener</w:t>
+            </w:r>
+            <w:r>
+              <w:t xml:space="preserve"> </w:t>
+            </w:r>
+            <w:r>
+              <w:rPr>
+                <w:bCs/>
+                <w:b/>
+              </w:rPr>
+              <w:t xml:space="preserve">un solo autor</w:t>
+            </w:r>
+            <w:r>
+              <w:t xml:space="preserve"> </w:t>
+            </w:r>
+            <w:r>
+              <w:t xml:space="preserve">(W. A. Mayta Arotaype), lo que elimina la inconsistencia de nombres y afiliaciones.</w:t>
             </w:r>
             <w:r>
               <w:t xml:space="preserve"> </w:t>
@@ -1852,7 +1887,7 @@
               <w:t xml:space="preserve"> </w:t>
             </w:r>
             <w:r>
-              <w:t xml:space="preserve">el correo del tercer autor y las fechas reales del historial del protocolo.</w:t>
+              <w:t xml:space="preserve">las fechas reales del historial del protocolo.</w:t>
             </w:r>
           </w:p>
         </w:tc>
@@ -2015,7 +2050,7 @@
               <w:jc w:val="left"/>
             </w:pPr>
             <w:r>
-              <w:t xml:space="preserve">Se añadió la lista PRISMA 2020 con la ubicación de cada ítem (Anexo D, Tabla 24), un espacio para el registro OSF y una declaración de uso de IA generativa (a completar). La disponibilidad de datos apunta al repositorio de la RSL.</w:t>
+              <w:t xml:space="preserve">Se añadió la lista PRISMA 2020 con la ubicación de cada ítem (Anexo D, Tabla 24), un espacio para el registro OSF y una declaración de uso de IA generativa. La disponibilidad de datos apunta al repositorio de la RSL.</w:t>
             </w:r>
             <w:r>
               <w:t xml:space="preserve"> </w:t>

</xml_diff>